<commit_message>
Complete workbook prompts screenshots and handoff details
</commit_message>
<xml_diff>
--- a/docs/FGIp07_Трекер_Задач_Рабочая_Тетрадь_Case02_FILLED.docx
+++ b/docs/FGIp07_Трекер_Задач_Рабочая_Тетрадь_Case02_FILLED.docx
@@ -5255,19 +5255,8 @@
             <w:vAlign w:val="center"/>
           </w:tcPr>
           <w:p>
-            <w:pPr>
-              <w:rPr>
-                <w:sz w:val="24"/>
-                <w:szCs w:val="24"/>
-              </w:rPr>
-            </w:pPr>
-            <w:r>
-              <w:rPr>
-                <w:sz w:val="24"/>
-                <w:szCs w:val="24"/>
-                <w:rtl w:val="0"/>
-              </w:rPr>
-              <w:t xml:space="preserve">Фактический ключевой промпт не сохранён отдельным полем; разработка велась по TZ_CASE_01_v1.md и поэтапному плану.</w:t>
+            <w:r>
+              <w:t>Собери по ТЗ TZ_CASE_01_v1.md рабочий Operations &amp; Expense Tracker на Next.js/TypeScript: Dashboard, расходы, категории, задачи, статусы, приоритеты и фильтры; отдели domain-логику и repository от UI; добавь localStorage, демоданные, валидацию и тесты; затем проверь mobile-first интерфейс, lint, TypeScript, build и CRUD.</w:t>
             </w:r>
           </w:p>
         </w:tc>
@@ -5876,47 +5865,80 @@
             </w:tcMar>
           </w:tcPr>
           <w:p>
-            <w:pPr>
-              <w:spacing w:after="0" w:before="0" w:line="240" w:lineRule="auto"/>
-              <w:jc w:val="center"/>
-              <w:rPr>
-                <w:sz w:val="24"/>
-                <w:szCs w:val="24"/>
-              </w:rPr>
-            </w:pPr>
-            <w:r>
-              <w:rPr>
-                <w:rFonts w:ascii="Arial" w:cs="Arial" w:eastAsia="Arial" w:hAnsi="Arial"/>
-                <w:b w:val="1"/>
-                <w:bCs w:val="1"/>
-                <w:i w:val="0"/>
-                <w:iCs w:val="0"/>
-                <w:color w:val="667085"/>
-                <w:sz w:val="24"/>
-                <w:szCs w:val="24"/>
-                <w:rtl w:val="0"/>
-              </w:rPr>
-              <w:t xml:space="preserve">ВСТАВЬ 2 СКРИНШОТА: ПЕРВЫЙ ЗАПУСК + ФИНАЛЬНАЯ ВЕРСИЯ</w:t>
-            </w:r>
-            <w:r>
-              <w:rPr>
-                <w:rFonts w:ascii="Arial" w:cs="Arial" w:eastAsia="Arial" w:hAnsi="Arial"/>
-                <w:b w:val="0"/>
-                <w:bCs w:val="0"/>
-                <w:i w:val="1"/>
-                <w:iCs w:val="1"/>
-                <w:color w:val="667085"/>
-                <w:sz w:val="24"/>
-                <w:szCs w:val="24"/>
-                <w:rtl w:val="0"/>
-              </w:rPr>
-              <w:br w:type="textWrapping"/>
-              <w:t xml:space="preserve">[Вставь изображения рядом или одно под другим]</w:t>
-            </w:r>
-            <w:r>
-              <w:rPr>
-                <w:rtl w:val="0"/>
-              </w:rPr>
+            <w:r>
+              <w:t>Первый запуск / финальная версия:</w:t>
+            </w:r>
+          </w:p>
+          <w:p>
+            <w:r>
+              <w:drawing>
+                <wp:inline>
+                  <wp:extent cx="2743200" cy="1543050"/>
+                  <wp:docPr id="1" name="Picture 1"/>
+                  <wp:cNvGraphicFramePr>
+                    <a:graphicFrameLocks noChangeAspect="1"/>
+                  </wp:cNvGraphicFramePr>
+                  <a:graphic>
+                    <a:graphicData uri="http://schemas.openxmlformats.org/drawingml/2006/picture">
+                      <pic:pic>
+                        <pic:nvPicPr>
+                          <pic:cNvPr id="0" name="codex-clipboard-f5e122dc-e36f-4ce8-86c1-33c0bb341e62.png"/>
+                          <pic:cNvPicPr/>
+                        </pic:nvPicPr>
+                        <pic:blipFill>
+                          <a:blip r:embed="rId8"/>
+                          <a:stretch>
+                            <a:fillRect/>
+                          </a:stretch>
+                        </pic:blipFill>
+                        <pic:spPr>
+                          <a:xfrm>
+                            <a:off x="0" y="0"/>
+                            <a:ext cx="2743200" cy="1543050"/>
+                          </a:xfrm>
+                          <a:prstGeom prst="rect"/>
+                        </pic:spPr>
+                      </pic:pic>
+                    </a:graphicData>
+                  </a:graphic>
+                </wp:inline>
+              </w:drawing>
+            </w:r>
+          </w:p>
+          <w:p>
+            <w:r>
+              <w:drawing>
+                <wp:inline>
+                  <wp:extent cx="2743200" cy="1543050"/>
+                  <wp:docPr id="2" name="Picture 2"/>
+                  <wp:cNvGraphicFramePr>
+                    <a:graphicFrameLocks noChangeAspect="1"/>
+                  </wp:cNvGraphicFramePr>
+                  <a:graphic>
+                    <a:graphicData uri="http://schemas.openxmlformats.org/drawingml/2006/picture">
+                      <pic:pic>
+                        <pic:nvPicPr>
+                          <pic:cNvPr id="0" name="codex-clipboard-20243f9d-21ed-40ca-adf0-3095253a2308.png"/>
+                          <pic:cNvPicPr/>
+                        </pic:nvPicPr>
+                        <pic:blipFill>
+                          <a:blip r:embed="rId9"/>
+                          <a:stretch>
+                            <a:fillRect/>
+                          </a:stretch>
+                        </pic:blipFill>
+                        <pic:spPr>
+                          <a:xfrm>
+                            <a:off x="0" y="0"/>
+                            <a:ext cx="2743200" cy="1543050"/>
+                          </a:xfrm>
+                          <a:prstGeom prst="rect"/>
+                        </pic:spPr>
+                      </pic:pic>
+                    </a:graphicData>
+                  </a:graphic>
+                </wp:inline>
+              </w:drawing>
             </w:r>
           </w:p>
         </w:tc>
@@ -7290,7 +7312,7 @@
           </w:tcPr>
           <w:p>
             <w:r>
-              <w:t>Исправлены readiness checks, persistence orchestration, GitHub source connection, Runtime Next.js и Publish directory .next.</w:t>
+              <w:t>Собери по ТЗ Personal Expense Tracker на Next.js/TypeScript с поэтапной реализацией: локальный repository с заменяемым адаптером, типы доходов/расходов/категорий/бюджета, целые центы, воспроизводимые демоданные и unit-тесты; затем CRUD операций, категории, месячный бюджет, Dashboard, отчёты, фильтры и графики; отдели бизнес-логику от UI и хранения, проверь lint, TypeScript, build и browser tests.</w:t>
             </w:r>
           </w:p>
         </w:tc>
@@ -7788,7 +7810,79 @@
           </w:tcPr>
           <w:p>
             <w:r>
-              <w:t>Stages 1–6 завершены; commit 858ef89bc29457d9ebf6c2444cacd0655a3cd60d. Портфолио: да</w:t>
+              <w:t>Первый запуск / финальная версия:</w:t>
+            </w:r>
+          </w:p>
+          <w:p>
+            <w:r>
+              <w:drawing>
+                <wp:inline>
+                  <wp:extent cx="2743200" cy="1543050"/>
+                  <wp:docPr id="3" name="Picture 3"/>
+                  <wp:cNvGraphicFramePr>
+                    <a:graphicFrameLocks noChangeAspect="1"/>
+                  </wp:cNvGraphicFramePr>
+                  <a:graphic>
+                    <a:graphicData uri="http://schemas.openxmlformats.org/drawingml/2006/picture">
+                      <pic:pic>
+                        <pic:nvPicPr>
+                          <pic:cNvPr id="0" name="codex-clipboard-f5e122dc-e36f-4ce8-86c1-33c0bb341e62.png"/>
+                          <pic:cNvPicPr/>
+                        </pic:nvPicPr>
+                        <pic:blipFill>
+                          <a:blip r:embed="rId8"/>
+                          <a:stretch>
+                            <a:fillRect/>
+                          </a:stretch>
+                        </pic:blipFill>
+                        <pic:spPr>
+                          <a:xfrm>
+                            <a:off x="0" y="0"/>
+                            <a:ext cx="2743200" cy="1543050"/>
+                          </a:xfrm>
+                          <a:prstGeom prst="rect"/>
+                        </pic:spPr>
+                      </pic:pic>
+                    </a:graphicData>
+                  </a:graphic>
+                </wp:inline>
+              </w:drawing>
+            </w:r>
+          </w:p>
+          <w:p>
+            <w:r>
+              <w:drawing>
+                <wp:inline>
+                  <wp:extent cx="2743200" cy="1543050"/>
+                  <wp:docPr id="4" name="Picture 4"/>
+                  <wp:cNvGraphicFramePr>
+                    <a:graphicFrameLocks noChangeAspect="1"/>
+                  </wp:cNvGraphicFramePr>
+                  <a:graphic>
+                    <a:graphicData uri="http://schemas.openxmlformats.org/drawingml/2006/picture">
+                      <pic:pic>
+                        <pic:nvPicPr>
+                          <pic:cNvPr id="0" name="codex-clipboard-20243f9d-21ed-40ca-adf0-3095253a2308.png"/>
+                          <pic:cNvPicPr/>
+                        </pic:nvPicPr>
+                        <pic:blipFill>
+                          <a:blip r:embed="rId9"/>
+                          <a:stretch>
+                            <a:fillRect/>
+                          </a:stretch>
+                        </pic:blipFill>
+                        <pic:spPr>
+                          <a:xfrm>
+                            <a:off x="0" y="0"/>
+                            <a:ext cx="2743200" cy="1543050"/>
+                          </a:xfrm>
+                          <a:prstGeom prst="rect"/>
+                        </pic:spPr>
+                      </pic:pic>
+                    </a:graphicData>
+                  </a:graphic>
+                </wp:inline>
+              </w:drawing>
             </w:r>
           </w:p>
         </w:tc>
@@ -7906,31 +8000,8 @@
             <w:vAlign w:val="center"/>
           </w:tcPr>
           <w:p>
-            <w:pPr>
-              <w:spacing w:after="0" w:before="0" w:line="240" w:lineRule="auto"/>
-              <w:rPr>
-                <w:sz w:val="24"/>
-                <w:szCs w:val="24"/>
-              </w:rPr>
-            </w:pPr>
-            <w:r>
-              <w:rPr>
-                <w:rFonts w:ascii="Arial" w:cs="Arial" w:eastAsia="Arial" w:hAnsi="Arial"/>
-                <w:b w:val="0"/>
-                <w:bCs w:val="0"/>
-                <w:i w:val="1"/>
-                <w:iCs w:val="1"/>
-                <w:color w:val="667085"/>
-                <w:sz w:val="24"/>
-                <w:szCs w:val="24"/>
-                <w:rtl w:val="0"/>
-              </w:rPr>
-              <w:t xml:space="preserve">[Сколько запросил(а) бы за такой заказ]</w:t>
-            </w:r>
-            <w:r>
-              <w:rPr>
-                <w:rtl w:val="0"/>
-              </w:rPr>
+            <w:r>
+              <w:t>$150–250 стартовая цена; $250–500 реалистичный диапазон MVP.</w:t>
             </w:r>
           </w:p>
         </w:tc>
@@ -7999,31 +8070,8 @@
             <w:vAlign w:val="center"/>
           </w:tcPr>
           <w:p>
-            <w:pPr>
-              <w:spacing w:after="0" w:before="0" w:line="240" w:lineRule="auto"/>
-              <w:rPr>
-                <w:sz w:val="24"/>
-                <w:szCs w:val="24"/>
-              </w:rPr>
-            </w:pPr>
-            <w:r>
-              <w:rPr>
-                <w:rFonts w:ascii="Arial" w:cs="Arial" w:eastAsia="Arial" w:hAnsi="Arial"/>
-                <w:b w:val="0"/>
-                <w:bCs w:val="0"/>
-                <w:i w:val="1"/>
-                <w:iCs w:val="1"/>
-                <w:color w:val="667085"/>
-                <w:sz w:val="24"/>
-                <w:szCs w:val="24"/>
-                <w:rtl w:val="0"/>
-              </w:rPr>
-              <w:t xml:space="preserve">[Файлы / сервер / инструкция по деплою]</w:t>
-            </w:r>
-            <w:r>
-              <w:rPr>
-                <w:rtl w:val="0"/>
-              </w:rPr>
+            <w:r>
+              <w:t>Переданы GitHub repository, Netlify production URL, README и инструкции локального запуска. Deployment использует main и Next.js pipeline.</w:t>
             </w:r>
           </w:p>
         </w:tc>
@@ -8092,31 +8140,8 @@
             <w:vAlign w:val="center"/>
           </w:tcPr>
           <w:p>
-            <w:pPr>
-              <w:spacing w:after="0" w:before="0" w:line="240" w:lineRule="auto"/>
-              <w:rPr>
-                <w:sz w:val="24"/>
-                <w:szCs w:val="24"/>
-              </w:rPr>
-            </w:pPr>
-            <w:r>
-              <w:rPr>
-                <w:rFonts w:ascii="Arial" w:cs="Arial" w:eastAsia="Arial" w:hAnsi="Arial"/>
-                <w:b w:val="0"/>
-                <w:bCs w:val="0"/>
-                <w:i w:val="1"/>
-                <w:iCs w:val="1"/>
-                <w:color w:val="667085"/>
-                <w:sz w:val="24"/>
-                <w:szCs w:val="24"/>
-                <w:rtl w:val="0"/>
-              </w:rPr>
-              <w:t xml:space="preserve">[Поддержка / сервер / API / аналитика / уведомления]</w:t>
-            </w:r>
-            <w:r>
-              <w:rPr>
-                <w:rtl w:val="0"/>
-              </w:rPr>
+            <w:r>
+              <w:t>Поддержка и развитие; Supabase/Auth и облачная синхронизация; экспорт CSV/PDF; дополнительные отчёты, роли и уведомления.</w:t>
             </w:r>
           </w:p>
         </w:tc>
@@ -8185,31 +8210,8 @@
             <w:vAlign w:val="center"/>
           </w:tcPr>
           <w:p>
-            <w:pPr>
-              <w:spacing w:after="0" w:before="0" w:line="240" w:lineRule="auto"/>
-              <w:rPr>
-                <w:sz w:val="24"/>
-                <w:szCs w:val="24"/>
-              </w:rPr>
-            </w:pPr>
-            <w:r>
-              <w:rPr>
-                <w:rFonts w:ascii="Arial" w:cs="Arial" w:eastAsia="Arial" w:hAnsi="Arial"/>
-                <w:b w:val="0"/>
-                <w:bCs w:val="0"/>
-                <w:i w:val="1"/>
-                <w:iCs w:val="1"/>
-                <w:color w:val="667085"/>
-                <w:sz w:val="24"/>
-                <w:szCs w:val="24"/>
-                <w:rtl w:val="0"/>
-              </w:rPr>
-              <w:t xml:space="preserve">[____ ч ____ мин]   Портфолио: [ ] да  [ ] нет</w:t>
-            </w:r>
-            <w:r>
-              <w:rPr>
-                <w:rtl w:val="0"/>
-              </w:rPr>
+            <w:r>
+              <w:t>Stages 1–6 завершены; commit 2342829e97e94ce38aa116a44ba8deaa2cdca7a3. Полное время разработки не фиксировалось. Портфолио: да.</w:t>
             </w:r>
           </w:p>
         </w:tc>

</xml_diff>